<commit_message>
Optional space passcode; tester guide covers sharing and passcodes
Co-Authored-By: Claude Opus 5.5 <noreply@anthropic.com>
</commit_message>
<xml_diff>
--- a/docs/Agamya-Tester-Guide.docx
+++ b/docs/Agamya-Tester-Guide.docx
@@ -495,7 +495,7 @@
               <w:rPr>
                 <w:sz w:val="19"/>
               </w:rPr>
-              <w:t>The policies are titled plainly (no "template"). After accepting you reach Home.</w:t>
+              <w:t>The policies are titled plainly (no "template"). After accepting you reach Home, with Start buttons and your recent sessions.</w:t>
             </w:r>
           </w:p>
         </w:tc>
@@ -3092,7 +3092,981 @@
         <w:pStyle w:val="Heading1"/>
       </w:pPr>
       <w:r>
-        <w:t>9. Impact</w:t>
+        <w:t>9. Sharing and access</w:t>
+      </w:r>
+    </w:p>
+    <w:p>
+      <w:r>
+        <w:rPr>
+          <w:i/>
+          <w:color w:val="5C5148"/>
+        </w:rPr>
+        <w:t>Where: A confirmed Work Map; a second account invited to the same space</w:t>
+      </w:r>
+    </w:p>
+    <w:tbl>
+      <w:tblPr>
+        <w:tblStyle w:val="TableGrid"/>
+        <w:tblW w:type="auto" w:w="0"/>
+        <w:tblLook w:firstColumn="1" w:firstRow="1" w:lastColumn="0" w:lastRow="0" w:noHBand="0" w:noVBand="1" w:val="04A0"/>
+      </w:tblPr>
+      <w:tblGrid>
+        <w:gridCol w:w="1994"/>
+        <w:gridCol w:w="1994"/>
+        <w:gridCol w:w="1994"/>
+        <w:gridCol w:w="1994"/>
+        <w:gridCol w:w="1994"/>
+      </w:tblGrid>
+      <w:tr>
+        <w:tc>
+          <w:tcPr>
+            <w:tcW w:type="dxa" w:w="624"/>
+            <w:shd w:val="clear" w:color="auto" w:fill="163A5C"/>
+          </w:tcPr>
+          <w:p>
+            <w:r>
+              <w:rPr>
+                <w:b/>
+                <w:color w:val="FFFFFF"/>
+                <w:sz w:val="19"/>
+              </w:rPr>
+              <w:t>#</w:t>
+            </w:r>
+          </w:p>
+        </w:tc>
+        <w:tc>
+          <w:tcPr>
+            <w:tcW w:type="dxa" w:w="3061"/>
+            <w:shd w:val="clear" w:color="auto" w:fill="163A5C"/>
+          </w:tcPr>
+          <w:p>
+            <w:r>
+              <w:rPr>
+                <w:b/>
+                <w:color w:val="FFFFFF"/>
+                <w:sz w:val="19"/>
+              </w:rPr>
+              <w:t>Do this</w:t>
+            </w:r>
+          </w:p>
+        </w:tc>
+        <w:tc>
+          <w:tcPr>
+            <w:tcW w:type="dxa" w:w="3402"/>
+            <w:shd w:val="clear" w:color="auto" w:fill="163A5C"/>
+          </w:tcPr>
+          <w:p>
+            <w:r>
+              <w:rPr>
+                <w:b/>
+                <w:color w:val="FFFFFF"/>
+                <w:sz w:val="19"/>
+              </w:rPr>
+              <w:t>Expected</w:t>
+            </w:r>
+          </w:p>
+        </w:tc>
+        <w:tc>
+          <w:tcPr>
+            <w:tcW w:type="dxa" w:w="1134"/>
+            <w:shd w:val="clear" w:color="auto" w:fill="163A5C"/>
+          </w:tcPr>
+          <w:p>
+            <w:r>
+              <w:rPr>
+                <w:b/>
+                <w:color w:val="FFFFFF"/>
+                <w:sz w:val="19"/>
+              </w:rPr>
+              <w:t>Result</w:t>
+            </w:r>
+          </w:p>
+        </w:tc>
+        <w:tc>
+          <w:tcPr>
+            <w:tcW w:type="dxa" w:w="1531"/>
+            <w:shd w:val="clear" w:color="auto" w:fill="163A5C"/>
+          </w:tcPr>
+          <w:p>
+            <w:r>
+              <w:rPr>
+                <w:b/>
+                <w:color w:val="FFFFFF"/>
+                <w:sz w:val="19"/>
+              </w:rPr>
+              <w:t>Notes</w:t>
+            </w:r>
+          </w:p>
+        </w:tc>
+      </w:tr>
+      <w:tr>
+        <w:tc>
+          <w:tcPr>
+            <w:tcW w:type="dxa" w:w="624"/>
+          </w:tcPr>
+          <w:p>
+            <w:r>
+              <w:rPr>
+                <w:sz w:val="19"/>
+              </w:rPr>
+              <w:t>9.1</w:t>
+            </w:r>
+          </w:p>
+        </w:tc>
+        <w:tc>
+          <w:tcPr>
+            <w:tcW w:type="dxa" w:w="3061"/>
+          </w:tcPr>
+          <w:p>
+            <w:r>
+              <w:rPr>
+                <w:sz w:val="19"/>
+              </w:rPr>
+              <w:t>As the expert, press Yes, that's how it works.</w:t>
+            </w:r>
+          </w:p>
+        </w:tc>
+        <w:tc>
+          <w:tcPr>
+            <w:tcW w:type="dxa" w:w="3402"/>
+          </w:tcPr>
+          <w:p>
+            <w:r>
+              <w:rPr>
+                <w:sz w:val="19"/>
+              </w:rPr>
+              <w:t>Agamya asks "Who should learn from this?": Everyone in the space, chosen groups and people, or only me.</w:t>
+            </w:r>
+          </w:p>
+        </w:tc>
+        <w:tc>
+          <w:tcPr>
+            <w:tcW w:type="dxa" w:w="1134"/>
+          </w:tcPr>
+          <w:p>
+            <w:r>
+              <w:rPr>
+                <w:sz w:val="19"/>
+              </w:rPr>
+              <w:t>☐ Pass</w:t>
+              <w:br/>
+              <w:t>☐ Fail</w:t>
+            </w:r>
+          </w:p>
+        </w:tc>
+        <w:tc>
+          <w:tcPr>
+            <w:tcW w:type="dxa" w:w="1531"/>
+          </w:tcPr>
+          <w:p>
+            <w:r>
+              <w:rPr>
+                <w:sz w:val="19"/>
+              </w:rPr>
+            </w:r>
+          </w:p>
+        </w:tc>
+      </w:tr>
+      <w:tr>
+        <w:tc>
+          <w:tcPr>
+            <w:tcW w:type="dxa" w:w="624"/>
+          </w:tcPr>
+          <w:p>
+            <w:r>
+              <w:rPr>
+                <w:sz w:val="19"/>
+              </w:rPr>
+              <w:t>9.2</w:t>
+            </w:r>
+          </w:p>
+        </w:tc>
+        <w:tc>
+          <w:tcPr>
+            <w:tcW w:type="dxa" w:w="3061"/>
+          </w:tcPr>
+          <w:p>
+            <w:r>
+              <w:rPr>
+                <w:sz w:val="19"/>
+              </w:rPr>
+              <w:t>Choose Only me. Sign in as the second account (a learner) and open Learning.</w:t>
+            </w:r>
+          </w:p>
+        </w:tc>
+        <w:tc>
+          <w:tcPr>
+            <w:tcW w:type="dxa" w:w="3402"/>
+          </w:tcPr>
+          <w:p>
+            <w:r>
+              <w:rPr>
+                <w:sz w:val="19"/>
+              </w:rPr>
+              <w:t>The map's title is listed under "Other Work Maps in this space" with Request access; it cannot be opened.</w:t>
+            </w:r>
+          </w:p>
+        </w:tc>
+        <w:tc>
+          <w:tcPr>
+            <w:tcW w:type="dxa" w:w="1134"/>
+          </w:tcPr>
+          <w:p>
+            <w:r>
+              <w:rPr>
+                <w:sz w:val="19"/>
+              </w:rPr>
+              <w:t>☐ Pass</w:t>
+              <w:br/>
+              <w:t>☐ Fail</w:t>
+            </w:r>
+          </w:p>
+        </w:tc>
+        <w:tc>
+          <w:tcPr>
+            <w:tcW w:type="dxa" w:w="1531"/>
+          </w:tcPr>
+          <w:p>
+            <w:r>
+              <w:rPr>
+                <w:sz w:val="19"/>
+              </w:rPr>
+            </w:r>
+          </w:p>
+        </w:tc>
+      </w:tr>
+      <w:tr>
+        <w:tc>
+          <w:tcPr>
+            <w:tcW w:type="dxa" w:w="624"/>
+          </w:tcPr>
+          <w:p>
+            <w:r>
+              <w:rPr>
+                <w:sz w:val="19"/>
+              </w:rPr>
+              <w:t>9.3</w:t>
+            </w:r>
+          </w:p>
+        </w:tc>
+        <w:tc>
+          <w:tcPr>
+            <w:tcW w:type="dxa" w:w="3061"/>
+          </w:tcPr>
+          <w:p>
+            <w:r>
+              <w:rPr>
+                <w:sz w:val="19"/>
+              </w:rPr>
+              <w:t>Press Request access. As the expert (or a space admin or coordinator), open the inbox and press Share with them.</w:t>
+            </w:r>
+          </w:p>
+        </w:tc>
+        <w:tc>
+          <w:tcPr>
+            <w:tcW w:type="dxa" w:w="3402"/>
+          </w:tcPr>
+          <w:p>
+            <w:r>
+              <w:rPr>
+                <w:sz w:val="19"/>
+              </w:rPr>
+              <w:t>The learner is notified and the map appears under "Work Maps you can learn from".</w:t>
+            </w:r>
+          </w:p>
+        </w:tc>
+        <w:tc>
+          <w:tcPr>
+            <w:tcW w:type="dxa" w:w="1134"/>
+          </w:tcPr>
+          <w:p>
+            <w:r>
+              <w:rPr>
+                <w:sz w:val="19"/>
+              </w:rPr>
+              <w:t>☐ Pass</w:t>
+              <w:br/>
+              <w:t>☐ Fail</w:t>
+            </w:r>
+          </w:p>
+        </w:tc>
+        <w:tc>
+          <w:tcPr>
+            <w:tcW w:type="dxa" w:w="1531"/>
+          </w:tcPr>
+          <w:p>
+            <w:r>
+              <w:rPr>
+                <w:sz w:val="19"/>
+              </w:rPr>
+            </w:r>
+          </w:p>
+        </w:tc>
+      </w:tr>
+      <w:tr>
+        <w:tc>
+          <w:tcPr>
+            <w:tcW w:type="dxa" w:w="624"/>
+          </w:tcPr>
+          <w:p>
+            <w:r>
+              <w:rPr>
+                <w:sz w:val="19"/>
+              </w:rPr>
+              <w:t>9.4</w:t>
+            </w:r>
+          </w:p>
+        </w:tc>
+        <w:tc>
+          <w:tcPr>
+            <w:tcW w:type="dxa" w:w="3061"/>
+          </w:tcPr>
+          <w:p>
+            <w:r>
+              <w:rPr>
+                <w:sz w:val="19"/>
+              </w:rPr>
+              <w:t>As the expert, press Share on the map and choose a group.</w:t>
+            </w:r>
+          </w:p>
+        </w:tc>
+        <w:tc>
+          <w:tcPr>
+            <w:tcW w:type="dxa" w:w="3402"/>
+          </w:tcPr>
+          <w:p>
+            <w:r>
+              <w:rPr>
+                <w:sz w:val="19"/>
+              </w:rPr>
+              <w:t>Only members of that group (plus the expert and admins) can open it.</w:t>
+            </w:r>
+          </w:p>
+        </w:tc>
+        <w:tc>
+          <w:tcPr>
+            <w:tcW w:type="dxa" w:w="1134"/>
+          </w:tcPr>
+          <w:p>
+            <w:r>
+              <w:rPr>
+                <w:sz w:val="19"/>
+              </w:rPr>
+              <w:t>☐ Pass</w:t>
+              <w:br/>
+              <w:t>☐ Fail</w:t>
+            </w:r>
+          </w:p>
+        </w:tc>
+        <w:tc>
+          <w:tcPr>
+            <w:tcW w:type="dxa" w:w="1531"/>
+          </w:tcPr>
+          <w:p>
+            <w:r>
+              <w:rPr>
+                <w:sz w:val="19"/>
+              </w:rPr>
+            </w:r>
+          </w:p>
+        </w:tc>
+      </w:tr>
+      <w:tr>
+        <w:tc>
+          <w:tcPr>
+            <w:tcW w:type="dxa" w:w="624"/>
+          </w:tcPr>
+          <w:p>
+            <w:r>
+              <w:rPr>
+                <w:sz w:val="19"/>
+              </w:rPr>
+              <w:t>9.5</w:t>
+            </w:r>
+          </w:p>
+        </w:tc>
+        <w:tc>
+          <w:tcPr>
+            <w:tcW w:type="dxa" w:w="3061"/>
+          </w:tcPr>
+          <w:p>
+            <w:r>
+              <w:rPr>
+                <w:sz w:val="19"/>
+              </w:rPr>
+              <w:t>As the learner, ask a question on the Learning page about the shared map.</w:t>
+            </w:r>
+          </w:p>
+        </w:tc>
+        <w:tc>
+          <w:tcPr>
+            <w:tcW w:type="dxa" w:w="3402"/>
+          </w:tcPr>
+          <w:p>
+            <w:r>
+              <w:rPr>
+                <w:sz w:val="19"/>
+              </w:rPr>
+              <w:t>Ask answers from the Work Map, quoting the expert, instead of "nothing approved".</w:t>
+            </w:r>
+          </w:p>
+        </w:tc>
+        <w:tc>
+          <w:tcPr>
+            <w:tcW w:type="dxa" w:w="1134"/>
+          </w:tcPr>
+          <w:p>
+            <w:r>
+              <w:rPr>
+                <w:sz w:val="19"/>
+              </w:rPr>
+              <w:t>☐ Pass</w:t>
+              <w:br/>
+              <w:t>☐ Fail</w:t>
+            </w:r>
+          </w:p>
+        </w:tc>
+        <w:tc>
+          <w:tcPr>
+            <w:tcW w:type="dxa" w:w="1531"/>
+          </w:tcPr>
+          <w:p>
+            <w:r>
+              <w:rPr>
+                <w:sz w:val="19"/>
+              </w:rPr>
+            </w:r>
+          </w:p>
+        </w:tc>
+      </w:tr>
+      <w:tr>
+        <w:tc>
+          <w:tcPr>
+            <w:tcW w:type="dxa" w:w="624"/>
+          </w:tcPr>
+          <w:p>
+            <w:r>
+              <w:rPr>
+                <w:sz w:val="19"/>
+              </w:rPr>
+              <w:t>9.6</w:t>
+            </w:r>
+          </w:p>
+        </w:tc>
+        <w:tc>
+          <w:tcPr>
+            <w:tcW w:type="dxa" w:w="3061"/>
+          </w:tcPr>
+          <w:p>
+            <w:r>
+              <w:rPr>
+                <w:sz w:val="19"/>
+              </w:rPr>
+              <w:t>Create a second space from Spaces and open its inbox.</w:t>
+            </w:r>
+          </w:p>
+        </w:tc>
+        <w:tc>
+          <w:tcPr>
+            <w:tcW w:type="dxa" w:w="3402"/>
+          </w:tcPr>
+          <w:p>
+            <w:r>
+              <w:rPr>
+                <w:sz w:val="19"/>
+              </w:rPr>
+              <w:t>Only that space's notifications are listed; other spaces show only an unread count with Switch.</w:t>
+            </w:r>
+          </w:p>
+        </w:tc>
+        <w:tc>
+          <w:tcPr>
+            <w:tcW w:type="dxa" w:w="1134"/>
+          </w:tcPr>
+          <w:p>
+            <w:r>
+              <w:rPr>
+                <w:sz w:val="19"/>
+              </w:rPr>
+              <w:t>☐ Pass</w:t>
+              <w:br/>
+              <w:t>☐ Fail</w:t>
+            </w:r>
+          </w:p>
+        </w:tc>
+        <w:tc>
+          <w:tcPr>
+            <w:tcW w:type="dxa" w:w="1531"/>
+          </w:tcPr>
+          <w:p>
+            <w:r>
+              <w:rPr>
+                <w:sz w:val="19"/>
+              </w:rPr>
+            </w:r>
+          </w:p>
+        </w:tc>
+      </w:tr>
+      <w:tr>
+        <w:tc>
+          <w:tcPr>
+            <w:tcW w:type="dxa" w:w="624"/>
+          </w:tcPr>
+          <w:p>
+            <w:r>
+              <w:rPr>
+                <w:sz w:val="19"/>
+              </w:rPr>
+              <w:t>9.7</w:t>
+            </w:r>
+          </w:p>
+        </w:tc>
+        <w:tc>
+          <w:tcPr>
+            <w:tcW w:type="dxa" w:w="3061"/>
+          </w:tcPr>
+          <w:p>
+            <w:r>
+              <w:rPr>
+                <w:sz w:val="19"/>
+              </w:rPr>
+              <w:t>Look at your name chip in a space you created.</w:t>
+            </w:r>
+          </w:p>
+        </w:tc>
+        <w:tc>
+          <w:tcPr>
+            <w:tcW w:type="dxa" w:w="3402"/>
+          </w:tcPr>
+          <w:p>
+            <w:r>
+              <w:rPr>
+                <w:sz w:val="19"/>
+              </w:rPr>
+              <w:t>Your role reads "owner · admin".</w:t>
+            </w:r>
+          </w:p>
+        </w:tc>
+        <w:tc>
+          <w:tcPr>
+            <w:tcW w:type="dxa" w:w="1134"/>
+          </w:tcPr>
+          <w:p>
+            <w:r>
+              <w:rPr>
+                <w:sz w:val="19"/>
+              </w:rPr>
+              <w:t>☐ Pass</w:t>
+              <w:br/>
+              <w:t>☐ Fail</w:t>
+            </w:r>
+          </w:p>
+        </w:tc>
+        <w:tc>
+          <w:tcPr>
+            <w:tcW w:type="dxa" w:w="1531"/>
+          </w:tcPr>
+          <w:p>
+            <w:r>
+              <w:rPr>
+                <w:sz w:val="19"/>
+              </w:rPr>
+            </w:r>
+          </w:p>
+        </w:tc>
+      </w:tr>
+    </w:tbl>
+    <w:p>
+      <w:pPr>
+        <w:pStyle w:val="Heading1"/>
+      </w:pPr>
+      <w:r>
+        <w:t>10. Space passcode (optional)</w:t>
+      </w:r>
+    </w:p>
+    <w:p>
+      <w:r>
+        <w:rPr>
+          <w:i/>
+          <w:color w:val="5C5148"/>
+        </w:rPr>
+        <w:t>Where: Spaces page, as the space owner</w:t>
+      </w:r>
+    </w:p>
+    <w:tbl>
+      <w:tblPr>
+        <w:tblStyle w:val="TableGrid"/>
+        <w:tblW w:type="auto" w:w="0"/>
+        <w:tblLook w:firstColumn="1" w:firstRow="1" w:lastColumn="0" w:lastRow="0" w:noHBand="0" w:noVBand="1" w:val="04A0"/>
+      </w:tblPr>
+      <w:tblGrid>
+        <w:gridCol w:w="1994"/>
+        <w:gridCol w:w="1994"/>
+        <w:gridCol w:w="1994"/>
+        <w:gridCol w:w="1994"/>
+        <w:gridCol w:w="1994"/>
+      </w:tblGrid>
+      <w:tr>
+        <w:tc>
+          <w:tcPr>
+            <w:tcW w:type="dxa" w:w="624"/>
+            <w:shd w:val="clear" w:color="auto" w:fill="163A5C"/>
+          </w:tcPr>
+          <w:p>
+            <w:r>
+              <w:rPr>
+                <w:b/>
+                <w:color w:val="FFFFFF"/>
+                <w:sz w:val="19"/>
+              </w:rPr>
+              <w:t>#</w:t>
+            </w:r>
+          </w:p>
+        </w:tc>
+        <w:tc>
+          <w:tcPr>
+            <w:tcW w:type="dxa" w:w="3061"/>
+            <w:shd w:val="clear" w:color="auto" w:fill="163A5C"/>
+          </w:tcPr>
+          <w:p>
+            <w:r>
+              <w:rPr>
+                <w:b/>
+                <w:color w:val="FFFFFF"/>
+                <w:sz w:val="19"/>
+              </w:rPr>
+              <w:t>Do this</w:t>
+            </w:r>
+          </w:p>
+        </w:tc>
+        <w:tc>
+          <w:tcPr>
+            <w:tcW w:type="dxa" w:w="3402"/>
+            <w:shd w:val="clear" w:color="auto" w:fill="163A5C"/>
+          </w:tcPr>
+          <w:p>
+            <w:r>
+              <w:rPr>
+                <w:b/>
+                <w:color w:val="FFFFFF"/>
+                <w:sz w:val="19"/>
+              </w:rPr>
+              <w:t>Expected</w:t>
+            </w:r>
+          </w:p>
+        </w:tc>
+        <w:tc>
+          <w:tcPr>
+            <w:tcW w:type="dxa" w:w="1134"/>
+            <w:shd w:val="clear" w:color="auto" w:fill="163A5C"/>
+          </w:tcPr>
+          <w:p>
+            <w:r>
+              <w:rPr>
+                <w:b/>
+                <w:color w:val="FFFFFF"/>
+                <w:sz w:val="19"/>
+              </w:rPr>
+              <w:t>Result</w:t>
+            </w:r>
+          </w:p>
+        </w:tc>
+        <w:tc>
+          <w:tcPr>
+            <w:tcW w:type="dxa" w:w="1531"/>
+            <w:shd w:val="clear" w:color="auto" w:fill="163A5C"/>
+          </w:tcPr>
+          <w:p>
+            <w:r>
+              <w:rPr>
+                <w:b/>
+                <w:color w:val="FFFFFF"/>
+                <w:sz w:val="19"/>
+              </w:rPr>
+              <w:t>Notes</w:t>
+            </w:r>
+          </w:p>
+        </w:tc>
+      </w:tr>
+      <w:tr>
+        <w:tc>
+          <w:tcPr>
+            <w:tcW w:type="dxa" w:w="624"/>
+          </w:tcPr>
+          <w:p>
+            <w:r>
+              <w:rPr>
+                <w:sz w:val="19"/>
+              </w:rPr>
+              <w:t>10.1</w:t>
+            </w:r>
+          </w:p>
+        </w:tc>
+        <w:tc>
+          <w:tcPr>
+            <w:tcW w:type="dxa" w:w="3061"/>
+          </w:tcPr>
+          <w:p>
+            <w:r>
+              <w:rPr>
+                <w:sz w:val="19"/>
+              </w:rPr>
+              <w:t>Set a passcode of at least 6 characters.</w:t>
+            </w:r>
+          </w:p>
+        </w:tc>
+        <w:tc>
+          <w:tcPr>
+            <w:tcW w:type="dxa" w:w="3402"/>
+          </w:tcPr>
+          <w:p>
+            <w:r>
+              <w:rPr>
+                <w:sz w:val="19"/>
+              </w:rPr>
+              <w:t>"Passcode saved". Your own session stays open.</w:t>
+            </w:r>
+          </w:p>
+        </w:tc>
+        <w:tc>
+          <w:tcPr>
+            <w:tcW w:type="dxa" w:w="1134"/>
+          </w:tcPr>
+          <w:p>
+            <w:r>
+              <w:rPr>
+                <w:sz w:val="19"/>
+              </w:rPr>
+              <w:t>☐ Pass</w:t>
+              <w:br/>
+              <w:t>☐ Fail</w:t>
+            </w:r>
+          </w:p>
+        </w:tc>
+        <w:tc>
+          <w:tcPr>
+            <w:tcW w:type="dxa" w:w="1531"/>
+          </w:tcPr>
+          <w:p>
+            <w:r>
+              <w:rPr>
+                <w:sz w:val="19"/>
+              </w:rPr>
+            </w:r>
+          </w:p>
+        </w:tc>
+      </w:tr>
+      <w:tr>
+        <w:tc>
+          <w:tcPr>
+            <w:tcW w:type="dxa" w:w="624"/>
+          </w:tcPr>
+          <w:p>
+            <w:r>
+              <w:rPr>
+                <w:sz w:val="19"/>
+              </w:rPr>
+              <w:t>10.2</w:t>
+            </w:r>
+          </w:p>
+        </w:tc>
+        <w:tc>
+          <w:tcPr>
+            <w:tcW w:type="dxa" w:w="3061"/>
+          </w:tcPr>
+          <w:p>
+            <w:r>
+              <w:rPr>
+                <w:sz w:val="19"/>
+              </w:rPr>
+              <w:t>Sign in as another member of that space.</w:t>
+            </w:r>
+          </w:p>
+        </w:tc>
+        <w:tc>
+          <w:tcPr>
+            <w:tcW w:type="dxa" w:w="3402"/>
+          </w:tcPr>
+          <w:p>
+            <w:r>
+              <w:rPr>
+                <w:sz w:val="19"/>
+              </w:rPr>
+              <w:t>"&lt;space&gt; is locked": they must enter the passcode once; a wrong one is refused.</w:t>
+            </w:r>
+          </w:p>
+        </w:tc>
+        <w:tc>
+          <w:tcPr>
+            <w:tcW w:type="dxa" w:w="1134"/>
+          </w:tcPr>
+          <w:p>
+            <w:r>
+              <w:rPr>
+                <w:sz w:val="19"/>
+              </w:rPr>
+              <w:t>☐ Pass</w:t>
+              <w:br/>
+              <w:t>☐ Fail</w:t>
+            </w:r>
+          </w:p>
+        </w:tc>
+        <w:tc>
+          <w:tcPr>
+            <w:tcW w:type="dxa" w:w="1531"/>
+          </w:tcPr>
+          <w:p>
+            <w:r>
+              <w:rPr>
+                <w:sz w:val="19"/>
+              </w:rPr>
+            </w:r>
+          </w:p>
+        </w:tc>
+      </w:tr>
+      <w:tr>
+        <w:tc>
+          <w:tcPr>
+            <w:tcW w:type="dxa" w:w="624"/>
+          </w:tcPr>
+          <w:p>
+            <w:r>
+              <w:rPr>
+                <w:sz w:val="19"/>
+              </w:rPr>
+              <w:t>10.3</w:t>
+            </w:r>
+          </w:p>
+        </w:tc>
+        <w:tc>
+          <w:tcPr>
+            <w:tcW w:type="dxa" w:w="3061"/>
+          </w:tcPr>
+          <w:p>
+            <w:r>
+              <w:rPr>
+                <w:sz w:val="19"/>
+              </w:rPr>
+              <w:t>Enter the right passcode.</w:t>
+            </w:r>
+          </w:p>
+        </w:tc>
+        <w:tc>
+          <w:tcPr>
+            <w:tcW w:type="dxa" w:w="3402"/>
+          </w:tcPr>
+          <w:p>
+            <w:r>
+              <w:rPr>
+                <w:sz w:val="19"/>
+              </w:rPr>
+              <w:t>The space opens (policies first if they are new). Other spaces are not affected.</w:t>
+            </w:r>
+          </w:p>
+        </w:tc>
+        <w:tc>
+          <w:tcPr>
+            <w:tcW w:type="dxa" w:w="1134"/>
+          </w:tcPr>
+          <w:p>
+            <w:r>
+              <w:rPr>
+                <w:sz w:val="19"/>
+              </w:rPr>
+              <w:t>☐ Pass</w:t>
+              <w:br/>
+              <w:t>☐ Fail</w:t>
+            </w:r>
+          </w:p>
+        </w:tc>
+        <w:tc>
+          <w:tcPr>
+            <w:tcW w:type="dxa" w:w="1531"/>
+          </w:tcPr>
+          <w:p>
+            <w:r>
+              <w:rPr>
+                <w:sz w:val="19"/>
+              </w:rPr>
+            </w:r>
+          </w:p>
+        </w:tc>
+      </w:tr>
+      <w:tr>
+        <w:tc>
+          <w:tcPr>
+            <w:tcW w:type="dxa" w:w="624"/>
+          </w:tcPr>
+          <w:p>
+            <w:r>
+              <w:rPr>
+                <w:sz w:val="19"/>
+              </w:rPr>
+              <w:t>10.4</w:t>
+            </w:r>
+          </w:p>
+        </w:tc>
+        <w:tc>
+          <w:tcPr>
+            <w:tcW w:type="dxa" w:w="3061"/>
+          </w:tcPr>
+          <w:p>
+            <w:r>
+              <w:rPr>
+                <w:sz w:val="19"/>
+              </w:rPr>
+              <w:t>As the owner, change the passcode.</w:t>
+            </w:r>
+          </w:p>
+        </w:tc>
+        <w:tc>
+          <w:tcPr>
+            <w:tcW w:type="dxa" w:w="3402"/>
+          </w:tcPr>
+          <w:p>
+            <w:r>
+              <w:rPr>
+                <w:sz w:val="19"/>
+              </w:rPr>
+              <w:t>Everyone else must enter the new one.</w:t>
+            </w:r>
+          </w:p>
+        </w:tc>
+        <w:tc>
+          <w:tcPr>
+            <w:tcW w:type="dxa" w:w="1134"/>
+          </w:tcPr>
+          <w:p>
+            <w:r>
+              <w:rPr>
+                <w:sz w:val="19"/>
+              </w:rPr>
+              <w:t>☐ Pass</w:t>
+              <w:br/>
+              <w:t>☐ Fail</w:t>
+            </w:r>
+          </w:p>
+        </w:tc>
+        <w:tc>
+          <w:tcPr>
+            <w:tcW w:type="dxa" w:w="1531"/>
+          </w:tcPr>
+          <w:p>
+            <w:r>
+              <w:rPr>
+                <w:sz w:val="19"/>
+              </w:rPr>
+            </w:r>
+          </w:p>
+        </w:tc>
+      </w:tr>
+    </w:tbl>
+    <w:p>
+      <w:pPr>
+        <w:pStyle w:val="Heading1"/>
+      </w:pPr>
+      <w:r>
+        <w:t>11. Impact</w:t>
       </w:r>
     </w:p>
     <w:p>
@@ -3209,7 +4183,7 @@
               <w:rPr>
                 <w:sz w:val="19"/>
               </w:rPr>
-              <w:t>9.1</w:t>
+              <w:t>11.1</w:t>
             </w:r>
           </w:p>
         </w:tc>
@@ -3273,7 +4247,7 @@
         <w:pStyle w:val="Heading1"/>
       </w:pPr>
       <w:r>
-        <w:t>10. Spaces, people and sharing</w:t>
+        <w:t>12. Spaces, people and sharing</w:t>
       </w:r>
     </w:p>
     <w:p>
@@ -3390,7 +4364,7 @@
               <w:rPr>
                 <w:sz w:val="19"/>
               </w:rPr>
-              <w:t>10.1</w:t>
+              <w:t>12.1</w:t>
             </w:r>
           </w:p>
         </w:tc>
@@ -3458,7 +4432,7 @@
               <w:rPr>
                 <w:sz w:val="19"/>
               </w:rPr>
-              <w:t>10.2</w:t>
+              <w:t>12.2</w:t>
             </w:r>
           </w:p>
         </w:tc>
@@ -3526,7 +4500,7 @@
               <w:rPr>
                 <w:sz w:val="19"/>
               </w:rPr>
-              <w:t>10.3</w:t>
+              <w:t>12.3</w:t>
             </w:r>
           </w:p>
         </w:tc>
@@ -3594,7 +4568,7 @@
               <w:rPr>
                 <w:sz w:val="19"/>
               </w:rPr>
-              <w:t>10.4</w:t>
+              <w:t>12.4</w:t>
             </w:r>
           </w:p>
         </w:tc>
@@ -3662,7 +4636,7 @@
               <w:rPr>
                 <w:sz w:val="19"/>
               </w:rPr>
-              <w:t>10.5</w:t>
+              <w:t>12.5</w:t>
             </w:r>
           </w:p>
         </w:tc>

</xml_diff>

<commit_message>
Practise with the camera, phones, and removing people
- Practice: Start with my camera (or Share my screen); Moti is told it
  watches hands, tools and materials; Switch camera on phones.
- Phones and tablets cannot share a screen from a browser: the option is
  shown as unavailable with the reason, and capture offers the camera.
- iPhone Safari: audio contexts are created inside the tap so Moti's
  voice plays; the real microphone rate is sent when 16 kHz is refused.
- Owners and admins remove people from a space (access ends at once,
  groups left, contributions kept; owner rules enforced).

Co-Authored-By: Claude Opus 5.5 <noreply@anthropic.com>
</commit_message>
<xml_diff>
--- a/docs/Agamya-Tester-Guide.docx
+++ b/docs/Agamya-Tester-Guide.docx
@@ -610,7 +610,7 @@
           <w:i/>
           <w:color w:val="5C5148"/>
         </w:rPr>
-        <w:t>Where: Home → Start with your screen</w:t>
+        <w:t>Where: Home → Start with your screen (on a computer)</w:t>
       </w:r>
     </w:p>
     <w:tbl>
@@ -2520,7 +2520,7 @@
               <w:rPr>
                 <w:sz w:val="19"/>
               </w:rPr>
-              <w:t>Choose ಕನ್ನಡ (Kannada) or हिन्दी (Hindi) and share your screen.</w:t>
+              <w:t>Choose ಕನ್ನಡ (Kannada) or हिन्दी (Hindi) and press Start with my camera (on a phone) or Share my screen (on a computer).</w:t>
             </w:r>
           </w:p>
         </w:tc>
@@ -2533,7 +2533,7 @@
               <w:rPr>
                 <w:sz w:val="19"/>
               </w:rPr>
-              <w:t>Moti greets you in that language.</w:t>
+              <w:t>Moti greets you in that language. On a phone, Share my screen is shown as unavailable instead of failing.</w:t>
             </w:r>
           </w:p>
         </w:tc>
@@ -2588,7 +2588,7 @@
               <w:rPr>
                 <w:sz w:val="19"/>
               </w:rPr>
-              <w:t>Start doing the task the wrong way, e.g. say "I'm posting this 72,000 invoice now".</w:t>
+              <w:t>During camera practice on a phone, press Switch camera.</w:t>
             </w:r>
           </w:p>
         </w:tc>
@@ -2601,7 +2601,7 @@
               <w:rPr>
                 <w:sz w:val="19"/>
               </w:rPr>
-              <w:t>Moti stops you ("... would stop here. Why do you think?") and can show the expert's screen moment.</w:t>
+              <w:t>The picture switches between the back and the front camera.</w:t>
             </w:r>
           </w:p>
         </w:tc>
@@ -2644,6 +2644,74 @@
                 <w:sz w:val="19"/>
               </w:rPr>
               <w:t>7.3</w:t>
+            </w:r>
+          </w:p>
+        </w:tc>
+        <w:tc>
+          <w:tcPr>
+            <w:tcW w:type="dxa" w:w="3061"/>
+          </w:tcPr>
+          <w:p>
+            <w:r>
+              <w:rPr>
+                <w:sz w:val="19"/>
+              </w:rPr>
+              <w:t>Start doing the task the wrong way, e.g. say "I'm posting this 72,000 invoice now".</w:t>
+            </w:r>
+          </w:p>
+        </w:tc>
+        <w:tc>
+          <w:tcPr>
+            <w:tcW w:type="dxa" w:w="3402"/>
+          </w:tcPr>
+          <w:p>
+            <w:r>
+              <w:rPr>
+                <w:sz w:val="19"/>
+              </w:rPr>
+              <w:t>Moti stops you ("... would stop here. Why do you think?") and can show the expert's screen moment.</w:t>
+            </w:r>
+          </w:p>
+        </w:tc>
+        <w:tc>
+          <w:tcPr>
+            <w:tcW w:type="dxa" w:w="1134"/>
+          </w:tcPr>
+          <w:p>
+            <w:r>
+              <w:rPr>
+                <w:sz w:val="19"/>
+              </w:rPr>
+              <w:t>☐ Pass</w:t>
+              <w:br/>
+              <w:t>☐ Fail</w:t>
+            </w:r>
+          </w:p>
+        </w:tc>
+        <w:tc>
+          <w:tcPr>
+            <w:tcW w:type="dxa" w:w="1531"/>
+          </w:tcPr>
+          <w:p>
+            <w:r>
+              <w:rPr>
+                <w:sz w:val="19"/>
+              </w:rPr>
+            </w:r>
+          </w:p>
+        </w:tc>
+      </w:tr>
+      <w:tr>
+        <w:tc>
+          <w:tcPr>
+            <w:tcW w:type="dxa" w:w="624"/>
+          </w:tcPr>
+          <w:p>
+            <w:r>
+              <w:rPr>
+                <w:sz w:val="19"/>
+              </w:rPr>
+              <w:t>7.4</w:t>
             </w:r>
           </w:p>
         </w:tc>
@@ -4663,6 +4731,74 @@
                 <w:sz w:val="19"/>
               </w:rPr>
               <w:t>It disappears from the list.</w:t>
+            </w:r>
+          </w:p>
+        </w:tc>
+        <w:tc>
+          <w:tcPr>
+            <w:tcW w:type="dxa" w:w="1134"/>
+          </w:tcPr>
+          <w:p>
+            <w:r>
+              <w:rPr>
+                <w:sz w:val="19"/>
+              </w:rPr>
+              <w:t>☐ Pass</w:t>
+              <w:br/>
+              <w:t>☐ Fail</w:t>
+            </w:r>
+          </w:p>
+        </w:tc>
+        <w:tc>
+          <w:tcPr>
+            <w:tcW w:type="dxa" w:w="1531"/>
+          </w:tcPr>
+          <w:p>
+            <w:r>
+              <w:rPr>
+                <w:sz w:val="19"/>
+              </w:rPr>
+            </w:r>
+          </w:p>
+        </w:tc>
+      </w:tr>
+      <w:tr>
+        <w:tc>
+          <w:tcPr>
+            <w:tcW w:type="dxa" w:w="624"/>
+          </w:tcPr>
+          <w:p>
+            <w:r>
+              <w:rPr>
+                <w:sz w:val="19"/>
+              </w:rPr>
+              <w:t>12.6</w:t>
+            </w:r>
+          </w:p>
+        </w:tc>
+        <w:tc>
+          <w:tcPr>
+            <w:tcW w:type="dxa" w:w="3061"/>
+          </w:tcPr>
+          <w:p>
+            <w:r>
+              <w:rPr>
+                <w:sz w:val="19"/>
+              </w:rPr>
+              <w:t>As an owner or admin, open People (or Administration) and press Remove from space on a member, then confirm.</w:t>
+            </w:r>
+          </w:p>
+        </w:tc>
+        <w:tc>
+          <w:tcPr>
+            <w:tcW w:type="dxa" w:w="3402"/>
+          </w:tcPr>
+          <w:p>
+            <w:r>
+              <w:rPr>
+                <w:sz w:val="19"/>
+              </w:rPr>
+              <w:t>They disappear from the list and from sharing choices; their access to the space ends at once. Only the owner can remove an owner or admin.</w:t>
             </w:r>
           </w:p>
         </w:tc>

</xml_diff>